<commit_message>
Clarify APV2 release document split
</commit_message>
<xml_diff>
--- a/paper_artifacts/release_20260614/APV2_新闻稿_让机器一直是它自己_20260614.docx
+++ b/paper_artifacts/release_20260614/APV2_新闻稿_让机器一直是它自己_20260614.docx
@@ -523,6 +523,18 @@
           <w:rFonts w:ascii="Microsoft YaHei" w:hAnsi="Microsoft YaHei" w:eastAsia="Microsoft YaHei"/>
           <w:sz w:val="21"/>
         </w:rPr>
+        <w:t>发布文档分为三类: 12 页短主文用于快速了解 APV2 的问题、机制和关键证据; 长篇技术报告用于完整承接公式、伪代码、白箱 trace、实验附录和审稿疑问回应; 本新闻稿用于媒体和普通技术读者快速理解这项工作的意义。</w:t>
+      </w:r>
+    </w:p>
+    <w:p>
+      <w:pPr>
+        <w:ind w:firstLine="420"/>
+      </w:pPr>
+      <w:r>
+        <w:rPr>
+          <w:rFonts w:ascii="Microsoft YaHei" w:hAnsi="Microsoft YaHei" w:eastAsia="Microsoft YaHei"/>
+          <w:sz w:val="21"/>
+        </w:rPr>
         <w:t>本次发布采用三个仓库:</w:t>
       </w:r>
     </w:p>

</xml_diff>

<commit_message>
Finalize APV2 release package
</commit_message>
<xml_diff>
--- a/paper_artifacts/release_20260614/APV2_新闻稿_让机器一直是它自己_20260614.docx
+++ b/paper_artifacts/release_20260614/APV2_新闻稿_让机器一直是它自己_20260614.docx
@@ -319,7 +319,7 @@
           <w:rFonts w:ascii="Microsoft YaHei" w:hAnsi="Microsoft YaHei" w:eastAsia="Microsoft YaHei"/>
           <w:sz w:val="21"/>
         </w:rPr>
-        <w:t>APV2 给出的是这种能力的底座。它不和大模型对立。大模型仍然可以作为教师、工具和评测者，但 APV2 要解决的是“一个系统怎样持续成为它自己”的底层工程问题。</w:t>
+        <w:t>APV2 给出的是这种能力的底座。大模型仍然可以作为教师、工具和评测者；APV2 负责把学习、行动、反馈、压力、感受和记忆组织成同一个持续主体的底层工程循环。</w:t>
       </w:r>
     </w:p>
     <w:p>
@@ -353,7 +353,7 @@
       <w:r>
         <w:drawing>
           <wp:inline xmlns:a="http://schemas.openxmlformats.org/drawingml/2006/main" xmlns:pic="http://schemas.openxmlformats.org/drawingml/2006/picture">
-            <wp:extent cx="5394960" cy="3715847"/>
+            <wp:extent cx="5394960" cy="3782219"/>
             <wp:docPr id="1" name="Picture 1"/>
             <wp:cNvGraphicFramePr>
               <a:graphicFrameLocks noChangeAspect="1"/>
@@ -362,7 +362,7 @@
               <a:graphicData uri="http://schemas.openxmlformats.org/drawingml/2006/picture">
                 <pic:pic>
                   <pic:nvPicPr>
-                    <pic:cNvPr id="0" name="f_ev1_evidence_panorama.png"/>
+                    <pic:cNvPr id="0" name="fig1_apv2_evidence_stack_journal.png"/>
                     <pic:cNvPicPr/>
                   </pic:nvPicPr>
                   <pic:blipFill>
@@ -374,7 +374,7 @@
                   <pic:spPr>
                     <a:xfrm>
                       <a:off x="0" y="0"/>
-                      <a:ext cx="5394960" cy="3715847"/>
+                      <a:ext cx="5394960" cy="3782219"/>
                     </a:xfrm>
                     <a:prstGeom prst="rect"/>
                   </pic:spPr>
@@ -450,7 +450,7 @@
       <w:r>
         <w:drawing>
           <wp:inline xmlns:a="http://schemas.openxmlformats.org/drawingml/2006/main" xmlns:pic="http://schemas.openxmlformats.org/drawingml/2006/picture">
-            <wp:extent cx="5394960" cy="2273738"/>
+            <wp:extent cx="5394960" cy="2564817"/>
             <wp:docPr id="2" name="Picture 2"/>
             <wp:cNvGraphicFramePr>
               <a:graphicFrameLocks noChangeAspect="1"/>
@@ -459,7 +459,7 @@
               <a:graphicData uri="http://schemas.openxmlformats.org/drawingml/2006/picture">
                 <pic:pic>
                   <pic:nvPicPr>
-                    <pic:cNvPr id="0" name="f_ev2_baseline_cost_vs_capability.png"/>
+                    <pic:cNvPr id="0" name="fig2_cost_capability_matrix_journal.png"/>
                     <pic:cNvPicPr/>
                   </pic:nvPicPr>
                   <pic:blipFill>
@@ -471,7 +471,7 @@
                   <pic:spPr>
                     <a:xfrm>
                       <a:off x="0" y="0"/>
-                      <a:ext cx="5394960" cy="2273738"/>
+                      <a:ext cx="5394960" cy="2564817"/>
                     </a:xfrm>
                     <a:prstGeom prst="rect"/>
                   </pic:spPr>
@@ -523,7 +523,7 @@
           <w:rFonts w:ascii="Microsoft YaHei" w:hAnsi="Microsoft YaHei" w:eastAsia="Microsoft YaHei"/>
           <w:sz w:val="21"/>
         </w:rPr>
-        <w:t>发布文档分为三类: 12 页短主文用于快速了解 APV2 的问题、机制和关键证据; 长篇技术报告用于完整承接公式、伪代码、白箱 trace、实验附录和审稿疑问回应; 本新闻稿用于媒体和普通技术读者快速理解这项工作的意义。</w:t>
+        <w:t>发布文档分为三类: 短主文用于快速了解 APV2 的问题、机制和关键证据; 长篇技术报告用于完整承接公式、伪代码、白箱 trace、实验附录和审稿疑问回应; 本新闻稿用于媒体和普通技术读者快速理解这项工作的意义。</w:t>
       </w:r>
     </w:p>
     <w:p>
@@ -642,7 +642,7 @@
           <w:rFonts w:ascii="Microsoft YaHei" w:hAnsi="Microsoft YaHei" w:eastAsia="Microsoft YaHei"/>
           <w:sz w:val="21"/>
         </w:rPr>
-        <w:t>APV2 的价值不在于宣称机器已经拥有完整人类心智，而在于它把一个过去很难落地的问题变成了可运行、可审计、可复现的工程原型: 一个系统如何在连续时间中持续成为它自己。</w:t>
+        <w:t>APV2 的价值在于把一个过去很难落地的问题变成了可运行、可审计、可复现的工程原型: 一个系统如何在连续时间中持续成为它自己，并在学习、反馈、打断、恢复和迁移中保持可追踪的主体连续性。</w:t>
       </w:r>
     </w:p>
     <w:p>

</xml_diff>